<commit_message>
Decision doc: add platform research section; research notes
Co-Authored-By: Claude Opus 5.5 <noreply@anthropic.com>
Claude-Session: https://claude.ai/code/session_01A3BbtAPdmDVwo8utPGgCiU
</commit_message>
<xml_diff>
--- a/docs/Evolution Golf - Klaviyo vs Spoks decision.docx
+++ b/docs/Evolution Golf - Klaviyo vs Spoks decision.docx
@@ -41,7 +41,7 @@
           <w:sz w:val="20"/>
           <w:szCs w:val="20"/>
         </w:rPr>
-        <w:t xml:space="preserve">For discussion between Layton and his business partner · 25 September 2026 · prepared with Claude from a hands-on test of both tools</w:t>
+        <w:t xml:space="preserve">For discussion between Layton and his business partner · updated 28 September 2026 · prepared with Claude from hands-on tests of Klaviyo and Spoks plus web research on alternatives</w:t>
       </w:r>
     </w:p>
     <w:p>
@@ -269,7 +269,7 @@
                 <w:sz w:val="19"/>
                 <w:szCs w:val="19"/>
               </w:rPr>
-              <w:t xml:space="preserve">[CONFIRM: current Klaviyo bill]</w:t>
+              <w:t xml:space="preserve">About $720/month list price at ~46k active profiles (≈£535 + VAT), SMS extra. [CONFIRM against our actual bill]</w:t>
             </w:r>
           </w:p>
         </w:tc>
@@ -1002,7 +1002,7 @@
         <w:spacing w:after="60"/>
       </w:pPr>
       <w:r>
-        <w:t xml:space="preserve">Cost: Klaviyo is typically far more expensive than Spoks at a 46k-contact list [CONFIRM against our actual bill].</w:t>
+        <w:t xml:space="preserve">Cost: about $720/month list price at ~46k active profiles, around 20× Spoks [CONFIRM against our actual bill]. Suppressing unengaged profiles lowers it.</w:t>
       </w:r>
     </w:p>
     <w:p>
@@ -1015,25 +1015,7 @@
         <w:spacing w:after="60"/>
       </w:pPr>
       <w:r>
-        <w:t xml:space="preserve">One thing still to test: whether Claude's code-built emails can use Klaviyo's reusable blocks, or only its drag-and-drop emails can.</w:t>
-      </w:r>
-    </w:p>
-    <w:p>
-      <w:pPr>
-        <w:pStyle w:val="Heading1"/>
-        <w:spacing w:after="140" w:before="320"/>
-      </w:pPr>
-      <w:r>
-        <w:t xml:space="preserve">4. Spoks</w:t>
-      </w:r>
-    </w:p>
-    <w:p>
-      <w:pPr>
-        <w:pStyle w:val="Heading2"/>
-        <w:spacing w:after="100" w:before="220"/>
-      </w:pPr>
-      <w:r>
-        <w:t xml:space="preserve">Pros</w:t>
+        <w:t xml:space="preserve">Klaviyo's raw API can now create flows (beta), but not edit them afterwards and not with A/B tests. The Klaviyo connector Claude uses cannot do it, so in practice flows stay manual.</w:t>
       </w:r>
     </w:p>
     <w:p>
@@ -1046,7 +1028,25 @@
         <w:spacing w:after="60"/>
       </w:pPr>
       <w:r>
-        <w:t xml:space="preserve">Much cheaper: $35/month with no monthly send cap.</w:t>
+        <w:t xml:space="preserve">Reusable blocks (universal content) do not work inside pure code-built emails; they need Klaviyo's "hybrid" template format.</w:t>
+      </w:r>
+    </w:p>
+    <w:p>
+      <w:pPr>
+        <w:pStyle w:val="Heading1"/>
+        <w:spacing w:after="140" w:before="320"/>
+      </w:pPr>
+      <w:r>
+        <w:t xml:space="preserve">4. Spoks</w:t>
+      </w:r>
+    </w:p>
+    <w:p>
+      <w:pPr>
+        <w:pStyle w:val="Heading2"/>
+        <w:spacing w:after="100" w:before="220"/>
+      </w:pPr>
+      <w:r>
+        <w:t xml:space="preserve">Pros</w:t>
       </w:r>
     </w:p>
     <w:p>
@@ -1059,7 +1059,7 @@
         <w:spacing w:after="60"/>
       </w:pPr>
       <w:r>
-        <w:t xml:space="preserve">Claude builds all the flows automatically, including triggers, delays, timing ("next day at 09:30") and audience filters. Nothing goes live until we switch it on.</w:t>
+        <w:t xml:space="preserve">Much cheaper: $35/month with no monthly send cap.</w:t>
       </w:r>
     </w:p>
     <w:p>
@@ -1072,7 +1072,7 @@
         <w:spacing w:after="60"/>
       </w:pPr>
       <w:r>
-        <w:t xml:space="preserve">Membership tier tags already sync from Shopify (Free, Club, Evolution Pro, Evolution Annual), so membership flows can trigger directly.</w:t>
+        <w:t xml:space="preserve">Claude builds all the flows automatically, including triggers, delays, timing ("next day at 09:30") and audience filters. Nothing goes live until we switch it on.</w:t>
       </w:r>
     </w:p>
     <w:p>
@@ -1085,7 +1085,7 @@
         <w:spacing w:after="60"/>
       </w:pPr>
       <w:r>
-        <w:t xml:space="preserve">Checkout and cart emails show the customer's real basket items with a link back to it.</w:t>
+        <w:t xml:space="preserve">Membership tier tags already sync from Shopify (Free, Club, Evolution Pro, Evolution Annual), so membership flows can trigger directly.</w:t>
       </w:r>
     </w:p>
     <w:p>
@@ -1098,16 +1098,7 @@
         <w:spacing w:after="60"/>
       </w:pPr>
       <w:r>
-        <w:t xml:space="preserve">Brand colours and fonts are already applied to the workspace (cream background, Fraunces/Inter, green buttons).</w:t>
-      </w:r>
-    </w:p>
-    <w:p>
-      <w:pPr>
-        <w:pStyle w:val="Heading2"/>
-        <w:spacing w:after="100" w:before="220"/>
-      </w:pPr>
-      <w:r>
-        <w:t xml:space="preserve">Cons</w:t>
+        <w:t xml:space="preserve">Checkout and cart emails show the customer's real basket items with a link back to it.</w:t>
       </w:r>
     </w:p>
     <w:p>
@@ -1120,7 +1111,16 @@
         <w:spacing w:after="60"/>
       </w:pPr>
       <w:r>
-        <w:t xml:space="preserve">Design is limited. No HTML or code, and no import of designs from other tools. Styling beyond the basics is done by hand in the editor.</w:t>
+        <w:t xml:space="preserve">Brand colours and fonts are already applied to the workspace (cream background, Fraunces/Inter, green buttons).</w:t>
+      </w:r>
+    </w:p>
+    <w:p>
+      <w:pPr>
+        <w:pStyle w:val="Heading2"/>
+        <w:spacing w:after="100" w:before="220"/>
+      </w:pPr>
+      <w:r>
+        <w:t xml:space="preserve">Cons</w:t>
       </w:r>
     </w:p>
     <w:p>
@@ -1133,7 +1133,7 @@
         <w:spacing w:after="60"/>
       </w:pPr>
       <w:r>
-        <w:t xml:space="preserve">Reusable blocks ("Components") can only be built by hand, and must be placed into each email by hand.</w:t>
+        <w:t xml:space="preserve">Design is limited. No HTML or code, and no import of designs from other tools. Styling beyond the basics is done by hand in the editor.</w:t>
       </w:r>
     </w:p>
     <w:p>
@@ -1146,6 +1146,19 @@
         <w:spacing w:after="60"/>
       </w:pPr>
       <w:r>
+        <w:t xml:space="preserve">Reusable blocks ("Components") can only be built by hand, and must be placed into each email by hand.</w:t>
+      </w:r>
+    </w:p>
+    <w:p>
+      <w:pPr>
+        <w:pStyle w:val="ListParagraph"/>
+        <w:numPr>
+          <w:ilvl w:val="0"/>
+          <w:numId w:val="2"/>
+        </w:numPr>
+        <w:spacing w:after="60"/>
+      </w:pPr>
+      <w:r>
         <w:t xml:space="preserve">Gaps against the build pack:</w:t>
       </w:r>
     </w:p>
@@ -1297,7 +1310,1451 @@
         <w:spacing w:after="140" w:before="320"/>
       </w:pPr>
       <w:r>
-        <w:t xml:space="preserve">6. What drives the choice</w:t>
+        <w:t xml:space="preserve">6. Other platforms researched (28 September)</w:t>
+      </w:r>
+    </w:p>
+    <w:p>
+      <w:pPr>
+        <w:spacing w:after="120"/>
+      </w:pPr>
+      <w:r>
+        <w:t xml:space="preserve">Web research on the main alternatives, checked against the same test: can Claude build the flows, can Claude build designed emails, and how well does it know Shopify. Figures come from search results rather than the vendors' own pricing pages, so treat prices as indicative and confirm before signing up.</w:t>
+      </w:r>
+    </w:p>
+    <w:tbl>
+      <w:tblPr>
+        <w:tblW w:type="dxa" w:w="9026"/>
+        <w:tblBorders>
+          <w:top w:val="single" w:color="auto" w:sz="4"/>
+          <w:left w:val="single" w:color="auto" w:sz="4"/>
+          <w:bottom w:val="single" w:color="auto" w:sz="4"/>
+          <w:right w:val="single" w:color="auto" w:sz="4"/>
+          <w:insideH w:val="single" w:color="auto" w:sz="4"/>
+          <w:insideV w:val="single" w:color="auto" w:sz="4"/>
+        </w:tblBorders>
+      </w:tblPr>
+      <w:tblGrid>
+        <w:gridCol w:w="1700"/>
+        <w:gridCol w:w="1650"/>
+        <w:gridCol w:w="1650"/>
+        <w:gridCol w:w="1650"/>
+        <w:gridCol w:w="2376"/>
+      </w:tblGrid>
+      <w:tr>
+        <w:trPr>
+          <w:tblHeader/>
+        </w:trPr>
+        <w:tc>
+          <w:tcPr>
+            <w:tcW w:type="dxa" w:w="1700"/>
+            <w:tcBorders>
+              <w:top w:val="single" w:color="E6E3DA" w:sz="4"/>
+              <w:left w:val="single" w:color="E6E3DA" w:sz="4"/>
+              <w:bottom w:val="single" w:color="E6E3DA" w:sz="4"/>
+              <w:right w:val="single" w:color="E6E3DA" w:sz="4"/>
+            </w:tcBorders>
+            <w:shd w:fill="003D27" w:color="auto" w:val="clear"/>
+            <w:tcMar>
+              <w:top w:type="dxa" w:w="80"/>
+              <w:left w:type="dxa" w:w="110"/>
+              <w:bottom w:type="dxa" w:w="80"/>
+              <w:right w:type="dxa" w:w="110"/>
+            </w:tcMar>
+          </w:tcPr>
+          <w:p>
+            <w:pPr>
+              <w:spacing w:after="40"/>
+            </w:pPr>
+            <w:r>
+              <w:rPr>
+                <w:b/>
+                <w:bCs/>
+                <w:color w:val="FFFFFF"/>
+                <w:sz w:val="19"/>
+                <w:szCs w:val="19"/>
+              </w:rPr>
+              <w:t xml:space="preserve">Platform</w:t>
+            </w:r>
+          </w:p>
+        </w:tc>
+        <w:tc>
+          <w:tcPr>
+            <w:tcW w:type="dxa" w:w="1650"/>
+            <w:tcBorders>
+              <w:top w:val="single" w:color="E6E3DA" w:sz="4"/>
+              <w:left w:val="single" w:color="E6E3DA" w:sz="4"/>
+              <w:bottom w:val="single" w:color="E6E3DA" w:sz="4"/>
+              <w:right w:val="single" w:color="E6E3DA" w:sz="4"/>
+            </w:tcBorders>
+            <w:shd w:fill="003D27" w:color="auto" w:val="clear"/>
+            <w:tcMar>
+              <w:top w:type="dxa" w:w="80"/>
+              <w:left w:type="dxa" w:w="110"/>
+              <w:bottom w:type="dxa" w:w="80"/>
+              <w:right w:type="dxa" w:w="110"/>
+            </w:tcMar>
+          </w:tcPr>
+          <w:p>
+            <w:pPr>
+              <w:spacing w:after="40"/>
+            </w:pPr>
+            <w:r>
+              <w:rPr>
+                <w:b/>
+                <w:bCs/>
+                <w:color w:val="FFFFFF"/>
+                <w:sz w:val="19"/>
+                <w:szCs w:val="19"/>
+              </w:rPr>
+              <w:t xml:space="preserve">Claude builds flows?</w:t>
+            </w:r>
+          </w:p>
+        </w:tc>
+        <w:tc>
+          <w:tcPr>
+            <w:tcW w:type="dxa" w:w="1650"/>
+            <w:tcBorders>
+              <w:top w:val="single" w:color="E6E3DA" w:sz="4"/>
+              <w:left w:val="single" w:color="E6E3DA" w:sz="4"/>
+              <w:bottom w:val="single" w:color="E6E3DA" w:sz="4"/>
+              <w:right w:val="single" w:color="E6E3DA" w:sz="4"/>
+            </w:tcBorders>
+            <w:shd w:fill="003D27" w:color="auto" w:val="clear"/>
+            <w:tcMar>
+              <w:top w:type="dxa" w:w="80"/>
+              <w:left w:type="dxa" w:w="110"/>
+              <w:bottom w:type="dxa" w:w="80"/>
+              <w:right w:type="dxa" w:w="110"/>
+            </w:tcMar>
+          </w:tcPr>
+          <w:p>
+            <w:pPr>
+              <w:spacing w:after="40"/>
+            </w:pPr>
+            <w:r>
+              <w:rPr>
+                <w:b/>
+                <w:bCs/>
+                <w:color w:val="FFFFFF"/>
+                <w:sz w:val="19"/>
+                <w:szCs w:val="19"/>
+              </w:rPr>
+              <w:t xml:space="preserve">Claude builds designed emails?</w:t>
+            </w:r>
+          </w:p>
+        </w:tc>
+        <w:tc>
+          <w:tcPr>
+            <w:tcW w:type="dxa" w:w="1650"/>
+            <w:tcBorders>
+              <w:top w:val="single" w:color="E6E3DA" w:sz="4"/>
+              <w:left w:val="single" w:color="E6E3DA" w:sz="4"/>
+              <w:bottom w:val="single" w:color="E6E3DA" w:sz="4"/>
+              <w:right w:val="single" w:color="E6E3DA" w:sz="4"/>
+            </w:tcBorders>
+            <w:shd w:fill="003D27" w:color="auto" w:val="clear"/>
+            <w:tcMar>
+              <w:top w:type="dxa" w:w="80"/>
+              <w:left w:type="dxa" w:w="110"/>
+              <w:bottom w:type="dxa" w:w="80"/>
+              <w:right w:type="dxa" w:w="110"/>
+            </w:tcMar>
+          </w:tcPr>
+          <w:p>
+            <w:pPr>
+              <w:spacing w:after="40"/>
+            </w:pPr>
+            <w:r>
+              <w:rPr>
+                <w:b/>
+                <w:bCs/>
+                <w:color w:val="FFFFFF"/>
+                <w:sz w:val="19"/>
+                <w:szCs w:val="19"/>
+              </w:rPr>
+              <w:t xml:space="preserve">Shopify depth</w:t>
+            </w:r>
+          </w:p>
+        </w:tc>
+        <w:tc>
+          <w:tcPr>
+            <w:tcW w:type="dxa" w:w="2376"/>
+            <w:tcBorders>
+              <w:top w:val="single" w:color="E6E3DA" w:sz="4"/>
+              <w:left w:val="single" w:color="E6E3DA" w:sz="4"/>
+              <w:bottom w:val="single" w:color="E6E3DA" w:sz="4"/>
+              <w:right w:val="single" w:color="E6E3DA" w:sz="4"/>
+            </w:tcBorders>
+            <w:shd w:fill="003D27" w:color="auto" w:val="clear"/>
+            <w:tcMar>
+              <w:top w:type="dxa" w:w="80"/>
+              <w:left w:type="dxa" w:w="110"/>
+              <w:bottom w:type="dxa" w:w="80"/>
+              <w:right w:type="dxa" w:w="110"/>
+            </w:tcMar>
+          </w:tcPr>
+          <w:p>
+            <w:pPr>
+              <w:spacing w:after="40"/>
+            </w:pPr>
+            <w:r>
+              <w:rPr>
+                <w:b/>
+                <w:bCs/>
+                <w:color w:val="FFFFFF"/>
+                <w:sz w:val="19"/>
+                <w:szCs w:val="19"/>
+              </w:rPr>
+              <w:t xml:space="preserve">Approx. cost at our size</w:t>
+            </w:r>
+          </w:p>
+        </w:tc>
+      </w:tr>
+      <w:tr>
+        <w:trPr>
+          <w:tblHeader w:val="false"/>
+        </w:trPr>
+        <w:tc>
+          <w:tcPr>
+            <w:tcW w:type="dxa" w:w="1700"/>
+            <w:tcBorders>
+              <w:top w:val="single" w:color="E6E3DA" w:sz="4"/>
+              <w:left w:val="single" w:color="E6E3DA" w:sz="4"/>
+              <w:bottom w:val="single" w:color="E6E3DA" w:sz="4"/>
+              <w:right w:val="single" w:color="E6E3DA" w:sz="4"/>
+            </w:tcBorders>
+            <w:shd w:fill="FAF7F1" w:color="auto" w:val="clear"/>
+            <w:tcMar>
+              <w:top w:type="dxa" w:w="80"/>
+              <w:left w:type="dxa" w:w="110"/>
+              <w:bottom w:type="dxa" w:w="80"/>
+              <w:right w:type="dxa" w:w="110"/>
+            </w:tcMar>
+          </w:tcPr>
+          <w:p>
+            <w:pPr>
+              <w:spacing w:after="40"/>
+            </w:pPr>
+            <w:r>
+              <w:rPr>
+                <w:b/>
+                <w:bCs/>
+                <w:sz w:val="19"/>
+                <w:szCs w:val="19"/>
+              </w:rPr>
+              <w:t xml:space="preserve">Spoks</w:t>
+            </w:r>
+          </w:p>
+        </w:tc>
+        <w:tc>
+          <w:tcPr>
+            <w:tcW w:type="dxa" w:w="1650"/>
+            <w:tcBorders>
+              <w:top w:val="single" w:color="E6E3DA" w:sz="4"/>
+              <w:left w:val="single" w:color="E6E3DA" w:sz="4"/>
+              <w:bottom w:val="single" w:color="E6E3DA" w:sz="4"/>
+              <w:right w:val="single" w:color="E6E3DA" w:sz="4"/>
+            </w:tcBorders>
+            <w:tcMar>
+              <w:top w:type="dxa" w:w="80"/>
+              <w:left w:type="dxa" w:w="110"/>
+              <w:bottom w:type="dxa" w:w="80"/>
+              <w:right w:type="dxa" w:w="110"/>
+            </w:tcMar>
+          </w:tcPr>
+          <w:p>
+            <w:pPr>
+              <w:spacing w:after="40"/>
+            </w:pPr>
+            <w:r>
+              <w:rPr>
+                <w:b w:val="false"/>
+                <w:bCs w:val="false"/>
+                <w:sz w:val="19"/>
+                <w:szCs w:val="19"/>
+              </w:rPr>
+              <w:t xml:space="preserve">Yes (tested)</w:t>
+            </w:r>
+          </w:p>
+        </w:tc>
+        <w:tc>
+          <w:tcPr>
+            <w:tcW w:type="dxa" w:w="1650"/>
+            <w:tcBorders>
+              <w:top w:val="single" w:color="E6E3DA" w:sz="4"/>
+              <w:left w:val="single" w:color="E6E3DA" w:sz="4"/>
+              <w:bottom w:val="single" w:color="E6E3DA" w:sz="4"/>
+              <w:right w:val="single" w:color="E6E3DA" w:sz="4"/>
+            </w:tcBorders>
+            <w:tcMar>
+              <w:top w:type="dxa" w:w="80"/>
+              <w:left w:type="dxa" w:w="110"/>
+              <w:bottom w:type="dxa" w:w="80"/>
+              <w:right w:type="dxa" w:w="110"/>
+            </w:tcMar>
+          </w:tcPr>
+          <w:p>
+            <w:pPr>
+              <w:spacing w:after="40"/>
+            </w:pPr>
+            <w:r>
+              <w:rPr>
+                <w:b w:val="false"/>
+                <w:bCs w:val="false"/>
+                <w:sz w:val="19"/>
+                <w:szCs w:val="19"/>
+              </w:rPr>
+              <w:t xml:space="preserve">No — basic blocks only (tested)</w:t>
+            </w:r>
+          </w:p>
+        </w:tc>
+        <w:tc>
+          <w:tcPr>
+            <w:tcW w:type="dxa" w:w="1650"/>
+            <w:tcBorders>
+              <w:top w:val="single" w:color="E6E3DA" w:sz="4"/>
+              <w:left w:val="single" w:color="E6E3DA" w:sz="4"/>
+              <w:bottom w:val="single" w:color="E6E3DA" w:sz="4"/>
+              <w:right w:val="single" w:color="E6E3DA" w:sz="4"/>
+            </w:tcBorders>
+            <w:tcMar>
+              <w:top w:type="dxa" w:w="80"/>
+              <w:left w:type="dxa" w:w="110"/>
+              <w:bottom w:type="dxa" w:w="80"/>
+              <w:right w:type="dxa" w:w="110"/>
+            </w:tcMar>
+          </w:tcPr>
+          <w:p>
+            <w:pPr>
+              <w:spacing w:after="40"/>
+            </w:pPr>
+            <w:r>
+              <w:rPr>
+                <w:b w:val="false"/>
+                <w:bCs w:val="false"/>
+                <w:sz w:val="19"/>
+                <w:szCs w:val="19"/>
+              </w:rPr>
+              <w:t xml:space="preserve">Good</w:t>
+            </w:r>
+          </w:p>
+        </w:tc>
+        <w:tc>
+          <w:tcPr>
+            <w:tcW w:type="dxa" w:w="2376"/>
+            <w:tcBorders>
+              <w:top w:val="single" w:color="E6E3DA" w:sz="4"/>
+              <w:left w:val="single" w:color="E6E3DA" w:sz="4"/>
+              <w:bottom w:val="single" w:color="E6E3DA" w:sz="4"/>
+              <w:right w:val="single" w:color="E6E3DA" w:sz="4"/>
+            </w:tcBorders>
+            <w:tcMar>
+              <w:top w:type="dxa" w:w="80"/>
+              <w:left w:type="dxa" w:w="110"/>
+              <w:bottom w:type="dxa" w:w="80"/>
+              <w:right w:type="dxa" w:w="110"/>
+            </w:tcMar>
+          </w:tcPr>
+          <w:p>
+            <w:pPr>
+              <w:spacing w:after="40"/>
+            </w:pPr>
+            <w:r>
+              <w:rPr>
+                <w:b w:val="false"/>
+                <w:bCs w:val="false"/>
+                <w:sz w:val="19"/>
+                <w:szCs w:val="19"/>
+              </w:rPr>
+              <w:t xml:space="preserve">$35/month</w:t>
+            </w:r>
+          </w:p>
+        </w:tc>
+      </w:tr>
+      <w:tr>
+        <w:trPr>
+          <w:tblHeader w:val="false"/>
+        </w:trPr>
+        <w:tc>
+          <w:tcPr>
+            <w:tcW w:type="dxa" w:w="1700"/>
+            <w:tcBorders>
+              <w:top w:val="single" w:color="E6E3DA" w:sz="4"/>
+              <w:left w:val="single" w:color="E6E3DA" w:sz="4"/>
+              <w:bottom w:val="single" w:color="E6E3DA" w:sz="4"/>
+              <w:right w:val="single" w:color="E6E3DA" w:sz="4"/>
+            </w:tcBorders>
+            <w:shd w:fill="FAF7F1" w:color="auto" w:val="clear"/>
+            <w:tcMar>
+              <w:top w:type="dxa" w:w="80"/>
+              <w:left w:type="dxa" w:w="110"/>
+              <w:bottom w:type="dxa" w:w="80"/>
+              <w:right w:type="dxa" w:w="110"/>
+            </w:tcMar>
+          </w:tcPr>
+          <w:p>
+            <w:pPr>
+              <w:spacing w:after="40"/>
+            </w:pPr>
+            <w:r>
+              <w:rPr>
+                <w:b/>
+                <w:bCs/>
+                <w:sz w:val="19"/>
+                <w:szCs w:val="19"/>
+              </w:rPr>
+              <w:t xml:space="preserve">Klaviyo</w:t>
+            </w:r>
+          </w:p>
+        </w:tc>
+        <w:tc>
+          <w:tcPr>
+            <w:tcW w:type="dxa" w:w="1650"/>
+            <w:tcBorders>
+              <w:top w:val="single" w:color="E6E3DA" w:sz="4"/>
+              <w:left w:val="single" w:color="E6E3DA" w:sz="4"/>
+              <w:bottom w:val="single" w:color="E6E3DA" w:sz="4"/>
+              <w:right w:val="single" w:color="E6E3DA" w:sz="4"/>
+            </w:tcBorders>
+            <w:tcMar>
+              <w:top w:type="dxa" w:w="80"/>
+              <w:left w:type="dxa" w:w="110"/>
+              <w:bottom w:type="dxa" w:w="80"/>
+              <w:right w:type="dxa" w:w="110"/>
+            </w:tcMar>
+          </w:tcPr>
+          <w:p>
+            <w:pPr>
+              <w:spacing w:after="40"/>
+            </w:pPr>
+            <w:r>
+              <w:rPr>
+                <w:b w:val="false"/>
+                <w:bCs w:val="false"/>
+                <w:sz w:val="19"/>
+                <w:szCs w:val="19"/>
+              </w:rPr>
+              <w:t xml:space="preserve">No via connector; beta API only</w:t>
+            </w:r>
+          </w:p>
+        </w:tc>
+        <w:tc>
+          <w:tcPr>
+            <w:tcW w:type="dxa" w:w="1650"/>
+            <w:tcBorders>
+              <w:top w:val="single" w:color="E6E3DA" w:sz="4"/>
+              <w:left w:val="single" w:color="E6E3DA" w:sz="4"/>
+              <w:bottom w:val="single" w:color="E6E3DA" w:sz="4"/>
+              <w:right w:val="single" w:color="E6E3DA" w:sz="4"/>
+            </w:tcBorders>
+            <w:tcMar>
+              <w:top w:type="dxa" w:w="80"/>
+              <w:left w:type="dxa" w:w="110"/>
+              <w:bottom w:type="dxa" w:w="80"/>
+              <w:right w:type="dxa" w:w="110"/>
+            </w:tcMar>
+          </w:tcPr>
+          <w:p>
+            <w:pPr>
+              <w:spacing w:after="40"/>
+            </w:pPr>
+            <w:r>
+              <w:rPr>
+                <w:b w:val="false"/>
+                <w:bCs w:val="false"/>
+                <w:sz w:val="19"/>
+                <w:szCs w:val="19"/>
+              </w:rPr>
+              <w:t xml:space="preserve">Yes (tools confirmed, not yet trialled)</w:t>
+            </w:r>
+          </w:p>
+        </w:tc>
+        <w:tc>
+          <w:tcPr>
+            <w:tcW w:type="dxa" w:w="1650"/>
+            <w:tcBorders>
+              <w:top w:val="single" w:color="E6E3DA" w:sz="4"/>
+              <w:left w:val="single" w:color="E6E3DA" w:sz="4"/>
+              <w:bottom w:val="single" w:color="E6E3DA" w:sz="4"/>
+              <w:right w:val="single" w:color="E6E3DA" w:sz="4"/>
+            </w:tcBorders>
+            <w:tcMar>
+              <w:top w:type="dxa" w:w="80"/>
+              <w:left w:type="dxa" w:w="110"/>
+              <w:bottom w:type="dxa" w:w="80"/>
+              <w:right w:type="dxa" w:w="110"/>
+            </w:tcMar>
+          </w:tcPr>
+          <w:p>
+            <w:pPr>
+              <w:spacing w:after="40"/>
+            </w:pPr>
+            <w:r>
+              <w:rPr>
+                <w:b w:val="false"/>
+                <w:bCs w:val="false"/>
+                <w:sz w:val="19"/>
+                <w:szCs w:val="19"/>
+              </w:rPr>
+              <w:t xml:space="preserve">Best</w:t>
+            </w:r>
+          </w:p>
+        </w:tc>
+        <w:tc>
+          <w:tcPr>
+            <w:tcW w:type="dxa" w:w="2376"/>
+            <w:tcBorders>
+              <w:top w:val="single" w:color="E6E3DA" w:sz="4"/>
+              <w:left w:val="single" w:color="E6E3DA" w:sz="4"/>
+              <w:bottom w:val="single" w:color="E6E3DA" w:sz="4"/>
+              <w:right w:val="single" w:color="E6E3DA" w:sz="4"/>
+            </w:tcBorders>
+            <w:tcMar>
+              <w:top w:type="dxa" w:w="80"/>
+              <w:left w:type="dxa" w:w="110"/>
+              <w:bottom w:type="dxa" w:w="80"/>
+              <w:right w:type="dxa" w:w="110"/>
+            </w:tcMar>
+          </w:tcPr>
+          <w:p>
+            <w:pPr>
+              <w:spacing w:after="40"/>
+            </w:pPr>
+            <w:r>
+              <w:rPr>
+                <w:b w:val="false"/>
+                <w:bCs w:val="false"/>
+                <w:sz w:val="19"/>
+                <w:szCs w:val="19"/>
+              </w:rPr>
+              <w:t xml:space="preserve">~$720/month</w:t>
+            </w:r>
+          </w:p>
+        </w:tc>
+      </w:tr>
+      <w:tr>
+        <w:trPr>
+          <w:tblHeader w:val="false"/>
+        </w:trPr>
+        <w:tc>
+          <w:tcPr>
+            <w:tcW w:type="dxa" w:w="1700"/>
+            <w:tcBorders>
+              <w:top w:val="single" w:color="E6E3DA" w:sz="4"/>
+              <w:left w:val="single" w:color="E6E3DA" w:sz="4"/>
+              <w:bottom w:val="single" w:color="E6E3DA" w:sz="4"/>
+              <w:right w:val="single" w:color="E6E3DA" w:sz="4"/>
+            </w:tcBorders>
+            <w:shd w:fill="FAF7F1" w:color="auto" w:val="clear"/>
+            <w:tcMar>
+              <w:top w:type="dxa" w:w="80"/>
+              <w:left w:type="dxa" w:w="110"/>
+              <w:bottom w:type="dxa" w:w="80"/>
+              <w:right w:type="dxa" w:w="110"/>
+            </w:tcMar>
+          </w:tcPr>
+          <w:p>
+            <w:pPr>
+              <w:spacing w:after="40"/>
+            </w:pPr>
+            <w:r>
+              <w:rPr>
+                <w:b/>
+                <w:bCs/>
+                <w:sz w:val="19"/>
+                <w:szCs w:val="19"/>
+              </w:rPr>
+              <w:t xml:space="preserve">Omnisend</w:t>
+            </w:r>
+          </w:p>
+        </w:tc>
+        <w:tc>
+          <w:tcPr>
+            <w:tcW w:type="dxa" w:w="1650"/>
+            <w:tcBorders>
+              <w:top w:val="single" w:color="E6E3DA" w:sz="4"/>
+              <w:left w:val="single" w:color="E6E3DA" w:sz="4"/>
+              <w:bottom w:val="single" w:color="E6E3DA" w:sz="4"/>
+              <w:right w:val="single" w:color="E6E3DA" w:sz="4"/>
+            </w:tcBorders>
+            <w:tcMar>
+              <w:top w:type="dxa" w:w="80"/>
+              <w:left w:type="dxa" w:w="110"/>
+              <w:bottom w:type="dxa" w:w="80"/>
+              <w:right w:type="dxa" w:w="110"/>
+            </w:tcMar>
+          </w:tcPr>
+          <w:p>
+            <w:pPr>
+              <w:spacing w:after="40"/>
+            </w:pPr>
+            <w:r>
+              <w:rPr>
+                <w:b w:val="false"/>
+                <w:bCs w:val="false"/>
+                <w:sz w:val="19"/>
+                <w:szCs w:val="19"/>
+              </w:rPr>
+              <w:t xml:space="preserve">Possibly — its official connector claims it can; unconfirmed</w:t>
+            </w:r>
+          </w:p>
+        </w:tc>
+        <w:tc>
+          <w:tcPr>
+            <w:tcW w:type="dxa" w:w="1650"/>
+            <w:tcBorders>
+              <w:top w:val="single" w:color="E6E3DA" w:sz="4"/>
+              <w:left w:val="single" w:color="E6E3DA" w:sz="4"/>
+              <w:bottom w:val="single" w:color="E6E3DA" w:sz="4"/>
+              <w:right w:val="single" w:color="E6E3DA" w:sz="4"/>
+            </w:tcBorders>
+            <w:tcMar>
+              <w:top w:type="dxa" w:w="80"/>
+              <w:left w:type="dxa" w:w="110"/>
+              <w:bottom w:type="dxa" w:w="80"/>
+              <w:right w:type="dxa" w:w="110"/>
+            </w:tcMar>
+          </w:tcPr>
+          <w:p>
+            <w:pPr>
+              <w:spacing w:after="40"/>
+            </w:pPr>
+            <w:r>
+              <w:rPr>
+                <w:b w:val="false"/>
+                <w:bCs w:val="false"/>
+                <w:sz w:val="19"/>
+                <w:szCs w:val="19"/>
+              </w:rPr>
+              <w:t xml:space="preserve">Yes — HTML import and reusable "Universal Layouts"</w:t>
+            </w:r>
+          </w:p>
+        </w:tc>
+        <w:tc>
+          <w:tcPr>
+            <w:tcW w:type="dxa" w:w="1650"/>
+            <w:tcBorders>
+              <w:top w:val="single" w:color="E6E3DA" w:sz="4"/>
+              <w:left w:val="single" w:color="E6E3DA" w:sz="4"/>
+              <w:bottom w:val="single" w:color="E6E3DA" w:sz="4"/>
+              <w:right w:val="single" w:color="E6E3DA" w:sz="4"/>
+            </w:tcBorders>
+            <w:tcMar>
+              <w:top w:type="dxa" w:w="80"/>
+              <w:left w:type="dxa" w:w="110"/>
+              <w:bottom w:type="dxa" w:w="80"/>
+              <w:right w:type="dxa" w:w="110"/>
+            </w:tcMar>
+          </w:tcPr>
+          <w:p>
+            <w:pPr>
+              <w:spacing w:after="40"/>
+            </w:pPr>
+            <w:r>
+              <w:rPr>
+                <w:b w:val="false"/>
+                <w:bCs w:val="false"/>
+                <w:sz w:val="19"/>
+                <w:szCs w:val="19"/>
+              </w:rPr>
+              <w:t xml:space="preserve">Good (Shopify-first); "delivered" and back-in-stock need extras</w:t>
+            </w:r>
+          </w:p>
+        </w:tc>
+        <w:tc>
+          <w:tcPr>
+            <w:tcW w:type="dxa" w:w="2376"/>
+            <w:tcBorders>
+              <w:top w:val="single" w:color="E6E3DA" w:sz="4"/>
+              <w:left w:val="single" w:color="E6E3DA" w:sz="4"/>
+              <w:bottom w:val="single" w:color="E6E3DA" w:sz="4"/>
+              <w:right w:val="single" w:color="E6E3DA" w:sz="4"/>
+            </w:tcBorders>
+            <w:tcMar>
+              <w:top w:type="dxa" w:w="80"/>
+              <w:left w:type="dxa" w:w="110"/>
+              <w:bottom w:type="dxa" w:w="80"/>
+              <w:right w:type="dxa" w:w="110"/>
+            </w:tcMar>
+          </w:tcPr>
+          <w:p>
+            <w:pPr>
+              <w:spacing w:after="40"/>
+            </w:pPr>
+            <w:r>
+              <w:rPr>
+                <w:b w:val="false"/>
+                <w:bCs w:val="false"/>
+                <w:sz w:val="19"/>
+                <w:szCs w:val="19"/>
+              </w:rPr>
+              <w:t xml:space="preserve">Not found — needs a quote</w:t>
+            </w:r>
+          </w:p>
+        </w:tc>
+      </w:tr>
+      <w:tr>
+        <w:trPr>
+          <w:tblHeader w:val="false"/>
+        </w:trPr>
+        <w:tc>
+          <w:tcPr>
+            <w:tcW w:type="dxa" w:w="1700"/>
+            <w:tcBorders>
+              <w:top w:val="single" w:color="E6E3DA" w:sz="4"/>
+              <w:left w:val="single" w:color="E6E3DA" w:sz="4"/>
+              <w:bottom w:val="single" w:color="E6E3DA" w:sz="4"/>
+              <w:right w:val="single" w:color="E6E3DA" w:sz="4"/>
+            </w:tcBorders>
+            <w:shd w:fill="FAF7F1" w:color="auto" w:val="clear"/>
+            <w:tcMar>
+              <w:top w:type="dxa" w:w="80"/>
+              <w:left w:type="dxa" w:w="110"/>
+              <w:bottom w:type="dxa" w:w="80"/>
+              <w:right w:type="dxa" w:w="110"/>
+            </w:tcMar>
+          </w:tcPr>
+          <w:p>
+            <w:pPr>
+              <w:spacing w:after="40"/>
+            </w:pPr>
+            <w:r>
+              <w:rPr>
+                <w:b/>
+                <w:bCs/>
+                <w:sz w:val="19"/>
+                <w:szCs w:val="19"/>
+              </w:rPr>
+              <w:t xml:space="preserve">Brevo</w:t>
+            </w:r>
+          </w:p>
+        </w:tc>
+        <w:tc>
+          <w:tcPr>
+            <w:tcW w:type="dxa" w:w="1650"/>
+            <w:tcBorders>
+              <w:top w:val="single" w:color="E6E3DA" w:sz="4"/>
+              <w:left w:val="single" w:color="E6E3DA" w:sz="4"/>
+              <w:bottom w:val="single" w:color="E6E3DA" w:sz="4"/>
+              <w:right w:val="single" w:color="E6E3DA" w:sz="4"/>
+            </w:tcBorders>
+            <w:tcMar>
+              <w:top w:type="dxa" w:w="80"/>
+              <w:left w:type="dxa" w:w="110"/>
+              <w:bottom w:type="dxa" w:w="80"/>
+              <w:right w:type="dxa" w:w="110"/>
+            </w:tcMar>
+          </w:tcPr>
+          <w:p>
+            <w:pPr>
+              <w:spacing w:after="40"/>
+            </w:pPr>
+            <w:r>
+              <w:rPr>
+                <w:b w:val="false"/>
+                <w:bCs w:val="false"/>
+                <w:sz w:val="19"/>
+                <w:szCs w:val="19"/>
+              </w:rPr>
+              <w:t xml:space="preserve">No — flows are built by hand</w:t>
+            </w:r>
+          </w:p>
+        </w:tc>
+        <w:tc>
+          <w:tcPr>
+            <w:tcW w:type="dxa" w:w="1650"/>
+            <w:tcBorders>
+              <w:top w:val="single" w:color="E6E3DA" w:sz="4"/>
+              <w:left w:val="single" w:color="E6E3DA" w:sz="4"/>
+              <w:bottom w:val="single" w:color="E6E3DA" w:sz="4"/>
+              <w:right w:val="single" w:color="E6E3DA" w:sz="4"/>
+            </w:tcBorders>
+            <w:tcMar>
+              <w:top w:type="dxa" w:w="80"/>
+              <w:left w:type="dxa" w:w="110"/>
+              <w:bottom w:type="dxa" w:w="80"/>
+              <w:right w:type="dxa" w:w="110"/>
+            </w:tcMar>
+          </w:tcPr>
+          <w:p>
+            <w:pPr>
+              <w:spacing w:after="40"/>
+            </w:pPr>
+            <w:r>
+              <w:rPr>
+                <w:b w:val="false"/>
+                <w:bCs w:val="false"/>
+                <w:sz w:val="19"/>
+                <w:szCs w:val="19"/>
+              </w:rPr>
+              <w:t xml:space="preserve">Yes — HTML templates via API; synced reusable sections</w:t>
+            </w:r>
+          </w:p>
+        </w:tc>
+        <w:tc>
+          <w:tcPr>
+            <w:tcW w:type="dxa" w:w="1650"/>
+            <w:tcBorders>
+              <w:top w:val="single" w:color="E6E3DA" w:sz="4"/>
+              <w:left w:val="single" w:color="E6E3DA" w:sz="4"/>
+              <w:bottom w:val="single" w:color="E6E3DA" w:sz="4"/>
+              <w:right w:val="single" w:color="E6E3DA" w:sz="4"/>
+            </w:tcBorders>
+            <w:tcMar>
+              <w:top w:type="dxa" w:w="80"/>
+              <w:left w:type="dxa" w:w="110"/>
+              <w:bottom w:type="dxa" w:w="80"/>
+              <w:right w:type="dxa" w:w="110"/>
+            </w:tcMar>
+          </w:tcPr>
+          <w:p>
+            <w:pPr>
+              <w:spacing w:after="40"/>
+            </w:pPr>
+            <w:r>
+              <w:rPr>
+                <w:b w:val="false"/>
+                <w:bCs w:val="false"/>
+                <w:sz w:val="19"/>
+                <w:szCs w:val="19"/>
+              </w:rPr>
+              <w:t xml:space="preserve">Moderate, via the PushOwl app</w:t>
+            </w:r>
+          </w:p>
+        </w:tc>
+        <w:tc>
+          <w:tcPr>
+            <w:tcW w:type="dxa" w:w="2376"/>
+            <w:tcBorders>
+              <w:top w:val="single" w:color="E6E3DA" w:sz="4"/>
+              <w:left w:val="single" w:color="E6E3DA" w:sz="4"/>
+              <w:bottom w:val="single" w:color="E6E3DA" w:sz="4"/>
+              <w:right w:val="single" w:color="E6E3DA" w:sz="4"/>
+            </w:tcBorders>
+            <w:tcMar>
+              <w:top w:type="dxa" w:w="80"/>
+              <w:left w:type="dxa" w:w="110"/>
+              <w:bottom w:type="dxa" w:w="80"/>
+              <w:right w:type="dxa" w:w="110"/>
+            </w:tcMar>
+          </w:tcPr>
+          <w:p>
+            <w:pPr>
+              <w:spacing w:after="40"/>
+            </w:pPr>
+            <w:r>
+              <w:rPr>
+                <w:b w:val="false"/>
+                <w:bCs w:val="false"/>
+                <w:sz w:val="19"/>
+                <w:szCs w:val="19"/>
+              </w:rPr>
+              <w:t xml:space="preserve">~$100–130/month</w:t>
+            </w:r>
+          </w:p>
+        </w:tc>
+      </w:tr>
+      <w:tr>
+        <w:trPr>
+          <w:tblHeader w:val="false"/>
+        </w:trPr>
+        <w:tc>
+          <w:tcPr>
+            <w:tcW w:type="dxa" w:w="1700"/>
+            <w:tcBorders>
+              <w:top w:val="single" w:color="E6E3DA" w:sz="4"/>
+              <w:left w:val="single" w:color="E6E3DA" w:sz="4"/>
+              <w:bottom w:val="single" w:color="E6E3DA" w:sz="4"/>
+              <w:right w:val="single" w:color="E6E3DA" w:sz="4"/>
+            </w:tcBorders>
+            <w:shd w:fill="FAF7F1" w:color="auto" w:val="clear"/>
+            <w:tcMar>
+              <w:top w:type="dxa" w:w="80"/>
+              <w:left w:type="dxa" w:w="110"/>
+              <w:bottom w:type="dxa" w:w="80"/>
+              <w:right w:type="dxa" w:w="110"/>
+            </w:tcMar>
+          </w:tcPr>
+          <w:p>
+            <w:pPr>
+              <w:spacing w:after="40"/>
+            </w:pPr>
+            <w:r>
+              <w:rPr>
+                <w:b/>
+                <w:bCs/>
+                <w:sz w:val="19"/>
+                <w:szCs w:val="19"/>
+              </w:rPr>
+              <w:t xml:space="preserve">MailerLite</w:t>
+            </w:r>
+          </w:p>
+        </w:tc>
+        <w:tc>
+          <w:tcPr>
+            <w:tcW w:type="dxa" w:w="1650"/>
+            <w:tcBorders>
+              <w:top w:val="single" w:color="E6E3DA" w:sz="4"/>
+              <w:left w:val="single" w:color="E6E3DA" w:sz="4"/>
+              <w:bottom w:val="single" w:color="E6E3DA" w:sz="4"/>
+              <w:right w:val="single" w:color="E6E3DA" w:sz="4"/>
+            </w:tcBorders>
+            <w:tcMar>
+              <w:top w:type="dxa" w:w="80"/>
+              <w:left w:type="dxa" w:w="110"/>
+              <w:bottom w:type="dxa" w:w="80"/>
+              <w:right w:type="dxa" w:w="110"/>
+            </w:tcMar>
+          </w:tcPr>
+          <w:p>
+            <w:pPr>
+              <w:spacing w:after="40"/>
+            </w:pPr>
+            <w:r>
+              <w:rPr>
+                <w:b w:val="false"/>
+                <w:bCs w:val="false"/>
+                <w:sz w:val="19"/>
+                <w:szCs w:val="19"/>
+              </w:rPr>
+              <w:t xml:space="preserve">Probably — official connector has a guided automation builder</w:t>
+            </w:r>
+          </w:p>
+        </w:tc>
+        <w:tc>
+          <w:tcPr>
+            <w:tcW w:type="dxa" w:w="1650"/>
+            <w:tcBorders>
+              <w:top w:val="single" w:color="E6E3DA" w:sz="4"/>
+              <w:left w:val="single" w:color="E6E3DA" w:sz="4"/>
+              <w:bottom w:val="single" w:color="E6E3DA" w:sz="4"/>
+              <w:right w:val="single" w:color="E6E3DA" w:sz="4"/>
+            </w:tcBorders>
+            <w:tcMar>
+              <w:top w:type="dxa" w:w="80"/>
+              <w:left w:type="dxa" w:w="110"/>
+              <w:bottom w:type="dxa" w:w="80"/>
+              <w:right w:type="dxa" w:w="110"/>
+            </w:tcMar>
+          </w:tcPr>
+          <w:p>
+            <w:pPr>
+              <w:spacing w:after="40"/>
+            </w:pPr>
+            <w:r>
+              <w:rPr>
+                <w:b w:val="false"/>
+                <w:bCs w:val="false"/>
+                <w:sz w:val="19"/>
+                <w:szCs w:val="19"/>
+              </w:rPr>
+              <w:t xml:space="preserve">Yes</w:t>
+            </w:r>
+          </w:p>
+        </w:tc>
+        <w:tc>
+          <w:tcPr>
+            <w:tcW w:type="dxa" w:w="1650"/>
+            <w:tcBorders>
+              <w:top w:val="single" w:color="E6E3DA" w:sz="4"/>
+              <w:left w:val="single" w:color="E6E3DA" w:sz="4"/>
+              <w:bottom w:val="single" w:color="E6E3DA" w:sz="4"/>
+              <w:right w:val="single" w:color="E6E3DA" w:sz="4"/>
+            </w:tcBorders>
+            <w:tcMar>
+              <w:top w:type="dxa" w:w="80"/>
+              <w:left w:type="dxa" w:w="110"/>
+              <w:bottom w:type="dxa" w:w="80"/>
+              <w:right w:type="dxa" w:w="110"/>
+            </w:tcMar>
+          </w:tcPr>
+          <w:p>
+            <w:pPr>
+              <w:spacing w:after="40"/>
+            </w:pPr>
+            <w:r>
+              <w:rPr>
+                <w:b w:val="false"/>
+                <w:bCs w:val="false"/>
+                <w:sz w:val="19"/>
+                <w:szCs w:val="19"/>
+              </w:rPr>
+              <w:t xml:space="preserve">Weak</w:t>
+            </w:r>
+          </w:p>
+        </w:tc>
+        <w:tc>
+          <w:tcPr>
+            <w:tcW w:type="dxa" w:w="2376"/>
+            <w:tcBorders>
+              <w:top w:val="single" w:color="E6E3DA" w:sz="4"/>
+              <w:left w:val="single" w:color="E6E3DA" w:sz="4"/>
+              <w:bottom w:val="single" w:color="E6E3DA" w:sz="4"/>
+              <w:right w:val="single" w:color="E6E3DA" w:sz="4"/>
+            </w:tcBorders>
+            <w:tcMar>
+              <w:top w:type="dxa" w:w="80"/>
+              <w:left w:type="dxa" w:w="110"/>
+              <w:bottom w:type="dxa" w:w="80"/>
+              <w:right w:type="dxa" w:w="110"/>
+            </w:tcMar>
+          </w:tcPr>
+          <w:p>
+            <w:pPr>
+              <w:spacing w:after="40"/>
+            </w:pPr>
+            <w:r>
+              <w:rPr>
+                <w:b w:val="false"/>
+                <w:bCs w:val="false"/>
+                <w:sz w:val="19"/>
+                <w:szCs w:val="19"/>
+              </w:rPr>
+              <w:t xml:space="preserve">~$160+/month</w:t>
+            </w:r>
+          </w:p>
+        </w:tc>
+      </w:tr>
+      <w:tr>
+        <w:trPr>
+          <w:tblHeader w:val="false"/>
+        </w:trPr>
+        <w:tc>
+          <w:tcPr>
+            <w:tcW w:type="dxa" w:w="1700"/>
+            <w:tcBorders>
+              <w:top w:val="single" w:color="E6E3DA" w:sz="4"/>
+              <w:left w:val="single" w:color="E6E3DA" w:sz="4"/>
+              <w:bottom w:val="single" w:color="E6E3DA" w:sz="4"/>
+              <w:right w:val="single" w:color="E6E3DA" w:sz="4"/>
+            </w:tcBorders>
+            <w:shd w:fill="FAF7F1" w:color="auto" w:val="clear"/>
+            <w:tcMar>
+              <w:top w:type="dxa" w:w="80"/>
+              <w:left w:type="dxa" w:w="110"/>
+              <w:bottom w:type="dxa" w:w="80"/>
+              <w:right w:type="dxa" w:w="110"/>
+            </w:tcMar>
+          </w:tcPr>
+          <w:p>
+            <w:pPr>
+              <w:spacing w:after="40"/>
+            </w:pPr>
+            <w:r>
+              <w:rPr>
+                <w:b/>
+                <w:bCs/>
+                <w:sz w:val="19"/>
+                <w:szCs w:val="19"/>
+              </w:rPr>
+              <w:t xml:space="preserve">Mailchimp, Drip, ActiveCampaign, Dotdigital</w:t>
+            </w:r>
+          </w:p>
+        </w:tc>
+        <w:tc>
+          <w:tcPr>
+            <w:tcW w:type="dxa" w:w="1650"/>
+            <w:tcBorders>
+              <w:top w:val="single" w:color="E6E3DA" w:sz="4"/>
+              <w:left w:val="single" w:color="E6E3DA" w:sz="4"/>
+              <w:bottom w:val="single" w:color="E6E3DA" w:sz="4"/>
+              <w:right w:val="single" w:color="E6E3DA" w:sz="4"/>
+            </w:tcBorders>
+            <w:tcMar>
+              <w:top w:type="dxa" w:w="80"/>
+              <w:left w:type="dxa" w:w="110"/>
+              <w:bottom w:type="dxa" w:w="80"/>
+              <w:right w:type="dxa" w:w="110"/>
+            </w:tcMar>
+          </w:tcPr>
+          <w:p>
+            <w:pPr>
+              <w:spacing w:after="40"/>
+            </w:pPr>
+            <w:r>
+              <w:rPr>
+                <w:b w:val="false"/>
+                <w:bCs w:val="false"/>
+                <w:sz w:val="19"/>
+                <w:szCs w:val="19"/>
+              </w:rPr>
+              <w:t xml:space="preserve">No</w:t>
+            </w:r>
+          </w:p>
+        </w:tc>
+        <w:tc>
+          <w:tcPr>
+            <w:tcW w:type="dxa" w:w="1650"/>
+            <w:tcBorders>
+              <w:top w:val="single" w:color="E6E3DA" w:sz="4"/>
+              <w:left w:val="single" w:color="E6E3DA" w:sz="4"/>
+              <w:bottom w:val="single" w:color="E6E3DA" w:sz="4"/>
+              <w:right w:val="single" w:color="E6E3DA" w:sz="4"/>
+            </w:tcBorders>
+            <w:tcMar>
+              <w:top w:type="dxa" w:w="80"/>
+              <w:left w:type="dxa" w:w="110"/>
+              <w:bottom w:type="dxa" w:w="80"/>
+              <w:right w:type="dxa" w:w="110"/>
+            </w:tcMar>
+          </w:tcPr>
+          <w:p>
+            <w:pPr>
+              <w:spacing w:after="40"/>
+            </w:pPr>
+            <w:r>
+              <w:rPr>
+                <w:b w:val="false"/>
+                <w:bCs w:val="false"/>
+                <w:sz w:val="19"/>
+                <w:szCs w:val="19"/>
+              </w:rPr>
+              <w:t xml:space="preserve">Mostly yes</w:t>
+            </w:r>
+          </w:p>
+        </w:tc>
+        <w:tc>
+          <w:tcPr>
+            <w:tcW w:type="dxa" w:w="1650"/>
+            <w:tcBorders>
+              <w:top w:val="single" w:color="E6E3DA" w:sz="4"/>
+              <w:left w:val="single" w:color="E6E3DA" w:sz="4"/>
+              <w:bottom w:val="single" w:color="E6E3DA" w:sz="4"/>
+              <w:right w:val="single" w:color="E6E3DA" w:sz="4"/>
+            </w:tcBorders>
+            <w:tcMar>
+              <w:top w:type="dxa" w:w="80"/>
+              <w:left w:type="dxa" w:w="110"/>
+              <w:bottom w:type="dxa" w:w="80"/>
+              <w:right w:type="dxa" w:w="110"/>
+            </w:tcMar>
+          </w:tcPr>
+          <w:p>
+            <w:pPr>
+              <w:spacing w:after="40"/>
+            </w:pPr>
+            <w:r>
+              <w:rPr>
+                <w:b w:val="false"/>
+                <w:bCs w:val="false"/>
+                <w:sz w:val="19"/>
+                <w:szCs w:val="19"/>
+              </w:rPr>
+              <w:t xml:space="preserve">Mixed</w:t>
+            </w:r>
+          </w:p>
+        </w:tc>
+        <w:tc>
+          <w:tcPr>
+            <w:tcW w:type="dxa" w:w="2376"/>
+            <w:tcBorders>
+              <w:top w:val="single" w:color="E6E3DA" w:sz="4"/>
+              <w:left w:val="single" w:color="E6E3DA" w:sz="4"/>
+              <w:bottom w:val="single" w:color="E6E3DA" w:sz="4"/>
+              <w:right w:val="single" w:color="E6E3DA" w:sz="4"/>
+            </w:tcBorders>
+            <w:tcMar>
+              <w:top w:type="dxa" w:w="80"/>
+              <w:left w:type="dxa" w:w="110"/>
+              <w:bottom w:type="dxa" w:w="80"/>
+              <w:right w:type="dxa" w:w="110"/>
+            </w:tcMar>
+          </w:tcPr>
+          <w:p>
+            <w:pPr>
+              <w:spacing w:after="40"/>
+            </w:pPr>
+            <w:r>
+              <w:rPr>
+                <w:b w:val="false"/>
+                <w:bCs w:val="false"/>
+                <w:sz w:val="19"/>
+                <w:szCs w:val="19"/>
+              </w:rPr>
+              <w:t xml:space="preserve">$450–$970/month or quote</w:t>
+            </w:r>
+          </w:p>
+        </w:tc>
+      </w:tr>
+      <w:tr>
+        <w:trPr>
+          <w:tblHeader w:val="false"/>
+        </w:trPr>
+        <w:tc>
+          <w:tcPr>
+            <w:tcW w:type="dxa" w:w="1700"/>
+            <w:tcBorders>
+              <w:top w:val="single" w:color="E6E3DA" w:sz="4"/>
+              <w:left w:val="single" w:color="E6E3DA" w:sz="4"/>
+              <w:bottom w:val="single" w:color="E6E3DA" w:sz="4"/>
+              <w:right w:val="single" w:color="E6E3DA" w:sz="4"/>
+            </w:tcBorders>
+            <w:shd w:fill="FAF7F1" w:color="auto" w:val="clear"/>
+            <w:tcMar>
+              <w:top w:type="dxa" w:w="80"/>
+              <w:left w:type="dxa" w:w="110"/>
+              <w:bottom w:type="dxa" w:w="80"/>
+              <w:right w:type="dxa" w:w="110"/>
+            </w:tcMar>
+          </w:tcPr>
+          <w:p>
+            <w:pPr>
+              <w:spacing w:after="40"/>
+            </w:pPr>
+            <w:r>
+              <w:rPr>
+                <w:b/>
+                <w:bCs/>
+                <w:sz w:val="19"/>
+                <w:szCs w:val="19"/>
+              </w:rPr>
+              <w:t xml:space="preserve">Shopify Messaging + Flow</w:t>
+            </w:r>
+          </w:p>
+        </w:tc>
+        <w:tc>
+          <w:tcPr>
+            <w:tcW w:type="dxa" w:w="1650"/>
+            <w:tcBorders>
+              <w:top w:val="single" w:color="E6E3DA" w:sz="4"/>
+              <w:left w:val="single" w:color="E6E3DA" w:sz="4"/>
+              <w:bottom w:val="single" w:color="E6E3DA" w:sz="4"/>
+              <w:right w:val="single" w:color="E6E3DA" w:sz="4"/>
+            </w:tcBorders>
+            <w:tcMar>
+              <w:top w:type="dxa" w:w="80"/>
+              <w:left w:type="dxa" w:w="110"/>
+              <w:bottom w:type="dxa" w:w="80"/>
+              <w:right w:type="dxa" w:w="110"/>
+            </w:tcMar>
+          </w:tcPr>
+          <w:p>
+            <w:pPr>
+              <w:spacing w:after="40"/>
+            </w:pPr>
+            <w:r>
+              <w:rPr>
+                <w:b w:val="false"/>
+                <w:bCs w:val="false"/>
+                <w:sz w:val="19"/>
+                <w:szCs w:val="19"/>
+              </w:rPr>
+              <w:t xml:space="preserve">Only Shopify's own in-app AI</w:t>
+            </w:r>
+          </w:p>
+        </w:tc>
+        <w:tc>
+          <w:tcPr>
+            <w:tcW w:type="dxa" w:w="1650"/>
+            <w:tcBorders>
+              <w:top w:val="single" w:color="E6E3DA" w:sz="4"/>
+              <w:left w:val="single" w:color="E6E3DA" w:sz="4"/>
+              <w:bottom w:val="single" w:color="E6E3DA" w:sz="4"/>
+              <w:right w:val="single" w:color="E6E3DA" w:sz="4"/>
+            </w:tcBorders>
+            <w:tcMar>
+              <w:top w:type="dxa" w:w="80"/>
+              <w:left w:type="dxa" w:w="110"/>
+              <w:bottom w:type="dxa" w:w="80"/>
+              <w:right w:type="dxa" w:w="110"/>
+            </w:tcMar>
+          </w:tcPr>
+          <w:p>
+            <w:pPr>
+              <w:spacing w:after="40"/>
+            </w:pPr>
+            <w:r>
+              <w:rPr>
+                <w:b w:val="false"/>
+                <w:bCs w:val="false"/>
+                <w:sz w:val="19"/>
+                <w:szCs w:val="19"/>
+              </w:rPr>
+              <w:t xml:space="preserve">No</w:t>
+            </w:r>
+          </w:p>
+        </w:tc>
+        <w:tc>
+          <w:tcPr>
+            <w:tcW w:type="dxa" w:w="1650"/>
+            <w:tcBorders>
+              <w:top w:val="single" w:color="E6E3DA" w:sz="4"/>
+              <w:left w:val="single" w:color="E6E3DA" w:sz="4"/>
+              <w:bottom w:val="single" w:color="E6E3DA" w:sz="4"/>
+              <w:right w:val="single" w:color="E6E3DA" w:sz="4"/>
+            </w:tcBorders>
+            <w:tcMar>
+              <w:top w:type="dxa" w:w="80"/>
+              <w:left w:type="dxa" w:w="110"/>
+              <w:bottom w:type="dxa" w:w="80"/>
+              <w:right w:type="dxa" w:w="110"/>
+            </w:tcMar>
+          </w:tcPr>
+          <w:p>
+            <w:pPr>
+              <w:spacing w:after="40"/>
+            </w:pPr>
+            <w:r>
+              <w:rPr>
+                <w:b w:val="false"/>
+                <w:bCs w:val="false"/>
+                <w:sz w:val="19"/>
+                <w:szCs w:val="19"/>
+              </w:rPr>
+              <w:t xml:space="preserve">Native</w:t>
+            </w:r>
+          </w:p>
+        </w:tc>
+        <w:tc>
+          <w:tcPr>
+            <w:tcW w:type="dxa" w:w="2376"/>
+            <w:tcBorders>
+              <w:top w:val="single" w:color="E6E3DA" w:sz="4"/>
+              <w:left w:val="single" w:color="E6E3DA" w:sz="4"/>
+              <w:bottom w:val="single" w:color="E6E3DA" w:sz="4"/>
+              <w:right w:val="single" w:color="E6E3DA" w:sz="4"/>
+            </w:tcBorders>
+            <w:tcMar>
+              <w:top w:type="dxa" w:w="80"/>
+              <w:left w:type="dxa" w:w="110"/>
+              <w:bottom w:type="dxa" w:w="80"/>
+              <w:right w:type="dxa" w:w="110"/>
+            </w:tcMar>
+          </w:tcPr>
+          <w:p>
+            <w:pPr>
+              <w:spacing w:after="40"/>
+            </w:pPr>
+            <w:r>
+              <w:rPr>
+                <w:b w:val="false"/>
+                <w:bCs w:val="false"/>
+                <w:sz w:val="19"/>
+                <w:szCs w:val="19"/>
+              </w:rPr>
+              <w:t xml:space="preserve">Very cheap</w:t>
+            </w:r>
+          </w:p>
+        </w:tc>
+      </w:tr>
+    </w:tbl>
+    <w:p>
+      <w:pPr>
+        <w:spacing w:after="120"/>
+      </w:pPr>
+      <w:r>
+        <w:t xml:space="preserve"/>
+      </w:r>
+    </w:p>
+    <w:p>
+      <w:pPr>
+        <w:pStyle w:val="Heading2"/>
+        <w:spacing w:after="100" w:before="220"/>
+      </w:pPr>
+      <w:r>
+        <w:t xml:space="preserve">What this means</w:t>
+      </w:r>
+    </w:p>
+    <w:p>
+      <w:pPr>
+        <w:pStyle w:val="ListParagraph"/>
+        <w:numPr>
+          <w:ilvl w:val="0"/>
+          <w:numId w:val="2"/>
+        </w:numPr>
+        <w:spacing w:after="60"/>
+      </w:pPr>
+      <w:r>
+        <w:rPr>
+          <w:b/>
+          <w:bCs/>
+        </w:rPr>
+        <w:t xml:space="preserve">No platform we can confirm lets Claude build both the flows and the designs. </w:t>
+      </w:r>
+      <w:r>
+        <w:t xml:space="preserve">Everyone else splits the work the same way as Klaviyo or Spoks.</w:t>
+      </w:r>
+    </w:p>
+    <w:p>
+      <w:pPr>
+        <w:pStyle w:val="ListParagraph"/>
+        <w:numPr>
+          <w:ilvl w:val="0"/>
+          <w:numId w:val="2"/>
+        </w:numPr>
+        <w:spacing w:after="60"/>
+      </w:pPr>
+      <w:r>
+        <w:rPr>
+          <w:b/>
+          <w:bCs/>
+        </w:rPr>
+        <w:t xml:space="preserve">Omnisend is the one to check. </w:t>
+      </w:r>
+      <w:r>
+        <w:t xml:space="preserve">If its connector really can build automations, it could be the only option where both halves are automated, with good Shopify coverage at a mid price. This needs a hands-on test on a free trial before we rely on it.</w:t>
+      </w:r>
+    </w:p>
+    <w:p>
+      <w:pPr>
+        <w:pStyle w:val="ListParagraph"/>
+        <w:numPr>
+          <w:ilvl w:val="0"/>
+          <w:numId w:val="2"/>
+        </w:numPr>
+        <w:spacing w:after="60"/>
+      </w:pPr>
+      <w:r>
+        <w:rPr>
+          <w:b/>
+          <w:bCs/>
+        </w:rPr>
+        <w:t xml:space="preserve">Brevo is a cheaper Klaviyo. </w:t>
+      </w:r>
+      <w:r>
+        <w:t xml:space="preserve">Claude would build the designs; we wire the flows by hand. Its Shopify link is thinner, and its discount codes share one fixed expiry date rather than "7 days from sending", which clashes with our coupon rules.</w:t>
+      </w:r>
+    </w:p>
+    <w:p>
+      <w:pPr>
+        <w:pStyle w:val="ListParagraph"/>
+        <w:numPr>
+          <w:ilvl w:val="0"/>
+          <w:numId w:val="2"/>
+        </w:numPr>
+        <w:spacing w:after="60"/>
+      </w:pPr>
+      <w:r>
+        <w:rPr>
+          <w:b/>
+          <w:bCs/>
+        </w:rPr>
+        <w:t xml:space="preserve">MailerLite is cheap and AI-buildable, but its Shopify logic is too thin </w:t>
+      </w:r>
+      <w:r>
+        <w:t xml:space="preserve">for the membership tiers and category routing we need.</w:t>
+      </w:r>
+    </w:p>
+    <w:p>
+      <w:pPr>
+        <w:pStyle w:val="ListParagraph"/>
+        <w:numPr>
+          <w:ilvl w:val="0"/>
+          <w:numId w:val="2"/>
+        </w:numPr>
+        <w:spacing w:after="60"/>
+      </w:pPr>
+      <w:r>
+        <w:t xml:space="preserve">Everything else is either more expensive than Klaviyo for less, or can't be built by an AI at all.</w:t>
+      </w:r>
+    </w:p>
+    <w:p>
+      <w:pPr>
+        <w:pStyle w:val="Heading1"/>
+        <w:spacing w:after="140" w:before="320"/>
+      </w:pPr>
+      <w:r>
+        <w:t xml:space="preserve">7. What drives the choice</w:t>
       </w:r>
     </w:p>
     <w:tbl>
@@ -1450,7 +2907,7 @@
                 <w:sz w:val="19"/>
                 <w:szCs w:val="19"/>
               </w:rPr>
-              <w:t xml:space="preserve">Spoks</w:t>
+              <w:t xml:space="preserve">Spoks, then Brevo</w:t>
             </w:r>
           </w:p>
         </w:tc>
@@ -1654,7 +3111,7 @@
                 <w:sz w:val="19"/>
                 <w:szCs w:val="19"/>
               </w:rPr>
-              <w:t xml:space="preserve">Spoks</w:t>
+              <w:t xml:space="preserve">Spoks (Omnisend if its test passes)</w:t>
             </w:r>
           </w:p>
         </w:tc>
@@ -1691,6 +3148,74 @@
                 <w:sz w:val="19"/>
                 <w:szCs w:val="19"/>
               </w:rPr>
+              <w:t xml:space="preserve">Automation of both flows and design</w:t>
+            </w:r>
+          </w:p>
+        </w:tc>
+        <w:tc>
+          <w:tcPr>
+            <w:tcW w:type="dxa" w:w="6026"/>
+            <w:tcBorders>
+              <w:top w:val="single" w:color="E6E3DA" w:sz="4"/>
+              <w:left w:val="single" w:color="E6E3DA" w:sz="4"/>
+              <w:bottom w:val="single" w:color="E6E3DA" w:sz="4"/>
+              <w:right w:val="single" w:color="E6E3DA" w:sz="4"/>
+            </w:tcBorders>
+            <w:tcMar>
+              <w:top w:type="dxa" w:w="80"/>
+              <w:left w:type="dxa" w:w="110"/>
+              <w:bottom w:type="dxa" w:w="80"/>
+              <w:right w:type="dxa" w:w="110"/>
+            </w:tcMar>
+          </w:tcPr>
+          <w:p>
+            <w:pPr>
+              <w:spacing w:after="40"/>
+            </w:pPr>
+            <w:r>
+              <w:rPr>
+                <w:b w:val="false"/>
+                <w:bCs w:val="false"/>
+                <w:sz w:val="19"/>
+                <w:szCs w:val="19"/>
+              </w:rPr>
+              <w:t xml:space="preserve">Omnisend, only if the trial confirms it</w:t>
+            </w:r>
+          </w:p>
+        </w:tc>
+      </w:tr>
+      <w:tr>
+        <w:trPr>
+          <w:tblHeader w:val="false"/>
+        </w:trPr>
+        <w:tc>
+          <w:tcPr>
+            <w:tcW w:type="dxa" w:w="3000"/>
+            <w:tcBorders>
+              <w:top w:val="single" w:color="E6E3DA" w:sz="4"/>
+              <w:left w:val="single" w:color="E6E3DA" w:sz="4"/>
+              <w:bottom w:val="single" w:color="E6E3DA" w:sz="4"/>
+              <w:right w:val="single" w:color="E6E3DA" w:sz="4"/>
+            </w:tcBorders>
+            <w:shd w:fill="FAF7F1" w:color="auto" w:val="clear"/>
+            <w:tcMar>
+              <w:top w:type="dxa" w:w="80"/>
+              <w:left w:type="dxa" w:w="110"/>
+              <w:bottom w:type="dxa" w:w="80"/>
+              <w:right w:type="dxa" w:w="110"/>
+            </w:tcMar>
+          </w:tcPr>
+          <w:p>
+            <w:pPr>
+              <w:spacing w:after="40"/>
+            </w:pPr>
+            <w:r>
+              <w:rPr>
+                <w:b/>
+                <w:bCs/>
+                <w:sz w:val="19"/>
+                <w:szCs w:val="19"/>
+              </w:rPr>
               <w:t xml:space="preserve">Following the build pack exactly</w:t>
             </w:r>
           </w:p>
@@ -1757,7 +3282,7 @@
         <w:spacing w:after="140" w:before="320"/>
       </w:pPr>
       <w:r>
-        <w:t xml:space="preserve">7. Next steps</w:t>
+        <w:t xml:space="preserve">8. Next steps</w:t>
       </w:r>
     </w:p>
     <w:p>
@@ -1771,6 +3296,19 @@
       </w:pPr>
       <w:r>
         <w:t xml:space="preserve">Confirm our current Klaviyo monthly cost so the saving is a real number.</w:t>
+      </w:r>
+    </w:p>
+    <w:p>
+      <w:pPr>
+        <w:pStyle w:val="ListParagraph"/>
+        <w:numPr>
+          <w:ilvl w:val="0"/>
+          <w:numId w:val="2"/>
+        </w:numPr>
+        <w:spacing w:after="60"/>
+      </w:pPr>
+      <w:r>
+        <w:t xml:space="preserve">Optional: a short Omnisend trial. Connect its connector to Claude and test building one abandonment flow with one designed email, draft only. This settles whether it beats both current options.</w:t>
       </w:r>
     </w:p>
     <w:p>

</xml_diff>

<commit_message>
Decision docs: use actual Klaviyo bill (£250/month) and add savings section
Co-Authored-By: Claude Opus 5.5 <noreply@anthropic.com>
Claude-Session: https://claude.ai/code/session_01A3BbtAPdmDVwo8utPGgCiU
</commit_message>
<xml_diff>
--- a/docs/Evolution Golf - Klaviyo vs Spoks decision.docx
+++ b/docs/Evolution Golf - Klaviyo vs Spoks decision.docx
@@ -269,7 +269,7 @@
                 <w:sz w:val="19"/>
                 <w:szCs w:val="19"/>
               </w:rPr>
-              <w:t xml:space="preserve">About $720/month list price at ~46k active profiles (≈£535 + VAT), SMS extra. [CONFIRM against our actual bill]</w:t>
+              <w:t xml:space="preserve">£250/month (our current bill), SMS extra. Rises as the list grows.</w:t>
             </w:r>
           </w:p>
         </w:tc>
@@ -300,7 +300,7 @@
                 <w:sz w:val="19"/>
                 <w:szCs w:val="19"/>
               </w:rPr>
-              <w:t xml:space="preserve">$35/month, no send cap (free plan is for stores under 1,000 contacts only). SMS is extra, on credits.</w:t>
+              <w:t xml:space="preserve">$35/month (≈£26), no send cap. SMS extra, on credits.</w:t>
             </w:r>
           </w:p>
         </w:tc>
@@ -1002,7 +1002,7 @@
         <w:spacing w:after="60"/>
       </w:pPr>
       <w:r>
-        <w:t xml:space="preserve">Cost: about $720/month list price at ~46k active profiles, around 20× Spoks [CONFIRM against our actual bill]. Suppressing unengaged profiles lowers it.</w:t>
+        <w:t xml:space="preserve">Cost: £250/month today, roughly 10× Spoks, and it rises as the list grows.</w:t>
       </w:r>
     </w:p>
     <w:p>
@@ -1827,7 +1827,7 @@
                 <w:sz w:val="19"/>
                 <w:szCs w:val="19"/>
               </w:rPr>
-              <w:t xml:space="preserve">~$720/month</w:t>
+              <w:t xml:space="preserve">£250/month (our bill)</w:t>
             </w:r>
           </w:p>
         </w:tc>
@@ -2149,7 +2149,7 @@
                 <w:sz w:val="19"/>
                 <w:szCs w:val="19"/>
               </w:rPr>
-              <w:t xml:space="preserve">~$100–130/month</w:t>
+              <w:t xml:space="preserve">~$100–130/month (≈£75–100)</w:t>
             </w:r>
           </w:p>
         </w:tc>
@@ -2754,7 +2754,592 @@
         <w:spacing w:after="140" w:before="320"/>
       </w:pPr>
       <w:r>
-        <w:t xml:space="preserve">7. What drives the choice</w:t>
+        <w:t xml:space="preserve">7. What the saving is worth</w:t>
+      </w:r>
+    </w:p>
+    <w:tbl>
+      <w:tblPr>
+        <w:tblW w:type="dxa" w:w="9026"/>
+        <w:tblBorders>
+          <w:top w:val="single" w:color="auto" w:sz="4"/>
+          <w:left w:val="single" w:color="auto" w:sz="4"/>
+          <w:bottom w:val="single" w:color="auto" w:sz="4"/>
+          <w:right w:val="single" w:color="auto" w:sz="4"/>
+          <w:insideH w:val="single" w:color="auto" w:sz="4"/>
+          <w:insideV w:val="single" w:color="auto" w:sz="4"/>
+        </w:tblBorders>
+      </w:tblPr>
+      <w:tblGrid>
+        <w:gridCol w:w="3000"/>
+        <w:gridCol w:w="2000"/>
+        <w:gridCol w:w="2000"/>
+        <w:gridCol w:w="2026"/>
+      </w:tblGrid>
+      <w:tr>
+        <w:trPr>
+          <w:tblHeader/>
+        </w:trPr>
+        <w:tc>
+          <w:tcPr>
+            <w:tcW w:type="dxa" w:w="3000"/>
+            <w:tcBorders>
+              <w:top w:val="single" w:color="E6E3DA" w:sz="4"/>
+              <w:left w:val="single" w:color="E6E3DA" w:sz="4"/>
+              <w:bottom w:val="single" w:color="E6E3DA" w:sz="4"/>
+              <w:right w:val="single" w:color="E6E3DA" w:sz="4"/>
+            </w:tcBorders>
+            <w:shd w:fill="003D27" w:color="auto" w:val="clear"/>
+            <w:tcMar>
+              <w:top w:type="dxa" w:w="80"/>
+              <w:left w:type="dxa" w:w="110"/>
+              <w:bottom w:type="dxa" w:w="80"/>
+              <w:right w:type="dxa" w:w="110"/>
+            </w:tcMar>
+          </w:tcPr>
+          <w:p>
+            <w:pPr>
+              <w:spacing w:after="40"/>
+            </w:pPr>
+            <w:r>
+              <w:rPr>
+                <w:b/>
+                <w:bCs/>
+                <w:color w:val="FFFFFF"/>
+                <w:sz w:val="19"/>
+                <w:szCs w:val="19"/>
+              </w:rPr>
+              <w:t xml:space="preserve">Platform</w:t>
+            </w:r>
+          </w:p>
+        </w:tc>
+        <w:tc>
+          <w:tcPr>
+            <w:tcW w:type="dxa" w:w="2000"/>
+            <w:tcBorders>
+              <w:top w:val="single" w:color="E6E3DA" w:sz="4"/>
+              <w:left w:val="single" w:color="E6E3DA" w:sz="4"/>
+              <w:bottom w:val="single" w:color="E6E3DA" w:sz="4"/>
+              <w:right w:val="single" w:color="E6E3DA" w:sz="4"/>
+            </w:tcBorders>
+            <w:shd w:fill="003D27" w:color="auto" w:val="clear"/>
+            <w:tcMar>
+              <w:top w:type="dxa" w:w="80"/>
+              <w:left w:type="dxa" w:w="110"/>
+              <w:bottom w:type="dxa" w:w="80"/>
+              <w:right w:type="dxa" w:w="110"/>
+            </w:tcMar>
+          </w:tcPr>
+          <w:p>
+            <w:pPr>
+              <w:spacing w:after="40"/>
+            </w:pPr>
+            <w:r>
+              <w:rPr>
+                <w:b/>
+                <w:bCs/>
+                <w:color w:val="FFFFFF"/>
+                <w:sz w:val="19"/>
+                <w:szCs w:val="19"/>
+              </w:rPr>
+              <w:t xml:space="preserve">Per month</w:t>
+            </w:r>
+          </w:p>
+        </w:tc>
+        <w:tc>
+          <w:tcPr>
+            <w:tcW w:type="dxa" w:w="2000"/>
+            <w:tcBorders>
+              <w:top w:val="single" w:color="E6E3DA" w:sz="4"/>
+              <w:left w:val="single" w:color="E6E3DA" w:sz="4"/>
+              <w:bottom w:val="single" w:color="E6E3DA" w:sz="4"/>
+              <w:right w:val="single" w:color="E6E3DA" w:sz="4"/>
+            </w:tcBorders>
+            <w:shd w:fill="003D27" w:color="auto" w:val="clear"/>
+            <w:tcMar>
+              <w:top w:type="dxa" w:w="80"/>
+              <w:left w:type="dxa" w:w="110"/>
+              <w:bottom w:type="dxa" w:w="80"/>
+              <w:right w:type="dxa" w:w="110"/>
+            </w:tcMar>
+          </w:tcPr>
+          <w:p>
+            <w:pPr>
+              <w:spacing w:after="40"/>
+            </w:pPr>
+            <w:r>
+              <w:rPr>
+                <w:b/>
+                <w:bCs/>
+                <w:color w:val="FFFFFF"/>
+                <w:sz w:val="19"/>
+                <w:szCs w:val="19"/>
+              </w:rPr>
+              <w:t xml:space="preserve">Saving vs Klaviyo / month</w:t>
+            </w:r>
+          </w:p>
+        </w:tc>
+        <w:tc>
+          <w:tcPr>
+            <w:tcW w:type="dxa" w:w="2026"/>
+            <w:tcBorders>
+              <w:top w:val="single" w:color="E6E3DA" w:sz="4"/>
+              <w:left w:val="single" w:color="E6E3DA" w:sz="4"/>
+              <w:bottom w:val="single" w:color="E6E3DA" w:sz="4"/>
+              <w:right w:val="single" w:color="E6E3DA" w:sz="4"/>
+            </w:tcBorders>
+            <w:shd w:fill="003D27" w:color="auto" w:val="clear"/>
+            <w:tcMar>
+              <w:top w:type="dxa" w:w="80"/>
+              <w:left w:type="dxa" w:w="110"/>
+              <w:bottom w:type="dxa" w:w="80"/>
+              <w:right w:type="dxa" w:w="110"/>
+            </w:tcMar>
+          </w:tcPr>
+          <w:p>
+            <w:pPr>
+              <w:spacing w:after="40"/>
+            </w:pPr>
+            <w:r>
+              <w:rPr>
+                <w:b/>
+                <w:bCs/>
+                <w:color w:val="FFFFFF"/>
+                <w:sz w:val="19"/>
+                <w:szCs w:val="19"/>
+              </w:rPr>
+              <w:t xml:space="preserve">Saving / year</w:t>
+            </w:r>
+          </w:p>
+        </w:tc>
+      </w:tr>
+      <w:tr>
+        <w:trPr>
+          <w:tblHeader w:val="false"/>
+        </w:trPr>
+        <w:tc>
+          <w:tcPr>
+            <w:tcW w:type="dxa" w:w="3000"/>
+            <w:tcBorders>
+              <w:top w:val="single" w:color="E6E3DA" w:sz="4"/>
+              <w:left w:val="single" w:color="E6E3DA" w:sz="4"/>
+              <w:bottom w:val="single" w:color="E6E3DA" w:sz="4"/>
+              <w:right w:val="single" w:color="E6E3DA" w:sz="4"/>
+            </w:tcBorders>
+            <w:shd w:fill="FAF7F1" w:color="auto" w:val="clear"/>
+            <w:tcMar>
+              <w:top w:type="dxa" w:w="80"/>
+              <w:left w:type="dxa" w:w="110"/>
+              <w:bottom w:type="dxa" w:w="80"/>
+              <w:right w:type="dxa" w:w="110"/>
+            </w:tcMar>
+          </w:tcPr>
+          <w:p>
+            <w:pPr>
+              <w:spacing w:after="40"/>
+            </w:pPr>
+            <w:r>
+              <w:rPr>
+                <w:b/>
+                <w:bCs/>
+                <w:sz w:val="19"/>
+                <w:szCs w:val="19"/>
+              </w:rPr>
+              <w:t xml:space="preserve">Klaviyo (today)</w:t>
+            </w:r>
+          </w:p>
+        </w:tc>
+        <w:tc>
+          <w:tcPr>
+            <w:tcW w:type="dxa" w:w="2000"/>
+            <w:tcBorders>
+              <w:top w:val="single" w:color="E6E3DA" w:sz="4"/>
+              <w:left w:val="single" w:color="E6E3DA" w:sz="4"/>
+              <w:bottom w:val="single" w:color="E6E3DA" w:sz="4"/>
+              <w:right w:val="single" w:color="E6E3DA" w:sz="4"/>
+            </w:tcBorders>
+            <w:tcMar>
+              <w:top w:type="dxa" w:w="80"/>
+              <w:left w:type="dxa" w:w="110"/>
+              <w:bottom w:type="dxa" w:w="80"/>
+              <w:right w:type="dxa" w:w="110"/>
+            </w:tcMar>
+          </w:tcPr>
+          <w:p>
+            <w:pPr>
+              <w:spacing w:after="40"/>
+            </w:pPr>
+            <w:r>
+              <w:rPr>
+                <w:b w:val="false"/>
+                <w:bCs w:val="false"/>
+                <w:sz w:val="19"/>
+                <w:szCs w:val="19"/>
+              </w:rPr>
+              <w:t xml:space="preserve">£250</w:t>
+            </w:r>
+          </w:p>
+        </w:tc>
+        <w:tc>
+          <w:tcPr>
+            <w:tcW w:type="dxa" w:w="2000"/>
+            <w:tcBorders>
+              <w:top w:val="single" w:color="E6E3DA" w:sz="4"/>
+              <w:left w:val="single" w:color="E6E3DA" w:sz="4"/>
+              <w:bottom w:val="single" w:color="E6E3DA" w:sz="4"/>
+              <w:right w:val="single" w:color="E6E3DA" w:sz="4"/>
+            </w:tcBorders>
+            <w:tcMar>
+              <w:top w:type="dxa" w:w="80"/>
+              <w:left w:type="dxa" w:w="110"/>
+              <w:bottom w:type="dxa" w:w="80"/>
+              <w:right w:type="dxa" w:w="110"/>
+            </w:tcMar>
+          </w:tcPr>
+          <w:p>
+            <w:pPr>
+              <w:spacing w:after="40"/>
+            </w:pPr>
+            <w:r>
+              <w:rPr>
+                <w:b w:val="false"/>
+                <w:bCs w:val="false"/>
+                <w:sz w:val="19"/>
+                <w:szCs w:val="19"/>
+              </w:rPr>
+              <w:t xml:space="preserve">—</w:t>
+            </w:r>
+          </w:p>
+        </w:tc>
+        <w:tc>
+          <w:tcPr>
+            <w:tcW w:type="dxa" w:w="2026"/>
+            <w:tcBorders>
+              <w:top w:val="single" w:color="E6E3DA" w:sz="4"/>
+              <w:left w:val="single" w:color="E6E3DA" w:sz="4"/>
+              <w:bottom w:val="single" w:color="E6E3DA" w:sz="4"/>
+              <w:right w:val="single" w:color="E6E3DA" w:sz="4"/>
+            </w:tcBorders>
+            <w:tcMar>
+              <w:top w:type="dxa" w:w="80"/>
+              <w:left w:type="dxa" w:w="110"/>
+              <w:bottom w:type="dxa" w:w="80"/>
+              <w:right w:type="dxa" w:w="110"/>
+            </w:tcMar>
+          </w:tcPr>
+          <w:p>
+            <w:pPr>
+              <w:spacing w:after="40"/>
+            </w:pPr>
+            <w:r>
+              <w:rPr>
+                <w:b w:val="false"/>
+                <w:bCs w:val="false"/>
+                <w:sz w:val="19"/>
+                <w:szCs w:val="19"/>
+              </w:rPr>
+              <w:t xml:space="preserve">—</w:t>
+            </w:r>
+          </w:p>
+        </w:tc>
+      </w:tr>
+      <w:tr>
+        <w:trPr>
+          <w:tblHeader w:val="false"/>
+        </w:trPr>
+        <w:tc>
+          <w:tcPr>
+            <w:tcW w:type="dxa" w:w="3000"/>
+            <w:tcBorders>
+              <w:top w:val="single" w:color="E6E3DA" w:sz="4"/>
+              <w:left w:val="single" w:color="E6E3DA" w:sz="4"/>
+              <w:bottom w:val="single" w:color="E6E3DA" w:sz="4"/>
+              <w:right w:val="single" w:color="E6E3DA" w:sz="4"/>
+            </w:tcBorders>
+            <w:shd w:fill="FAF7F1" w:color="auto" w:val="clear"/>
+            <w:tcMar>
+              <w:top w:type="dxa" w:w="80"/>
+              <w:left w:type="dxa" w:w="110"/>
+              <w:bottom w:type="dxa" w:w="80"/>
+              <w:right w:type="dxa" w:w="110"/>
+            </w:tcMar>
+          </w:tcPr>
+          <w:p>
+            <w:pPr>
+              <w:spacing w:after="40"/>
+            </w:pPr>
+            <w:r>
+              <w:rPr>
+                <w:b/>
+                <w:bCs/>
+                <w:sz w:val="19"/>
+                <w:szCs w:val="19"/>
+              </w:rPr>
+              <w:t xml:space="preserve">Spoks</w:t>
+            </w:r>
+          </w:p>
+        </w:tc>
+        <w:tc>
+          <w:tcPr>
+            <w:tcW w:type="dxa" w:w="2000"/>
+            <w:tcBorders>
+              <w:top w:val="single" w:color="E6E3DA" w:sz="4"/>
+              <w:left w:val="single" w:color="E6E3DA" w:sz="4"/>
+              <w:bottom w:val="single" w:color="E6E3DA" w:sz="4"/>
+              <w:right w:val="single" w:color="E6E3DA" w:sz="4"/>
+            </w:tcBorders>
+            <w:tcMar>
+              <w:top w:type="dxa" w:w="80"/>
+              <w:left w:type="dxa" w:w="110"/>
+              <w:bottom w:type="dxa" w:w="80"/>
+              <w:right w:type="dxa" w:w="110"/>
+            </w:tcMar>
+          </w:tcPr>
+          <w:p>
+            <w:pPr>
+              <w:spacing w:after="40"/>
+            </w:pPr>
+            <w:r>
+              <w:rPr>
+                <w:b w:val="false"/>
+                <w:bCs w:val="false"/>
+                <w:sz w:val="19"/>
+                <w:szCs w:val="19"/>
+              </w:rPr>
+              <w:t xml:space="preserve">≈£26</w:t>
+            </w:r>
+          </w:p>
+        </w:tc>
+        <w:tc>
+          <w:tcPr>
+            <w:tcW w:type="dxa" w:w="2000"/>
+            <w:tcBorders>
+              <w:top w:val="single" w:color="E6E3DA" w:sz="4"/>
+              <w:left w:val="single" w:color="E6E3DA" w:sz="4"/>
+              <w:bottom w:val="single" w:color="E6E3DA" w:sz="4"/>
+              <w:right w:val="single" w:color="E6E3DA" w:sz="4"/>
+            </w:tcBorders>
+            <w:tcMar>
+              <w:top w:type="dxa" w:w="80"/>
+              <w:left w:type="dxa" w:w="110"/>
+              <w:bottom w:type="dxa" w:w="80"/>
+              <w:right w:type="dxa" w:w="110"/>
+            </w:tcMar>
+          </w:tcPr>
+          <w:p>
+            <w:pPr>
+              <w:spacing w:after="40"/>
+            </w:pPr>
+            <w:r>
+              <w:rPr>
+                <w:b w:val="false"/>
+                <w:bCs w:val="false"/>
+                <w:sz w:val="19"/>
+                <w:szCs w:val="19"/>
+              </w:rPr>
+              <w:t xml:space="preserve">≈£224</w:t>
+            </w:r>
+          </w:p>
+        </w:tc>
+        <w:tc>
+          <w:tcPr>
+            <w:tcW w:type="dxa" w:w="2026"/>
+            <w:tcBorders>
+              <w:top w:val="single" w:color="E6E3DA" w:sz="4"/>
+              <w:left w:val="single" w:color="E6E3DA" w:sz="4"/>
+              <w:bottom w:val="single" w:color="E6E3DA" w:sz="4"/>
+              <w:right w:val="single" w:color="E6E3DA" w:sz="4"/>
+            </w:tcBorders>
+            <w:tcMar>
+              <w:top w:type="dxa" w:w="80"/>
+              <w:left w:type="dxa" w:w="110"/>
+              <w:bottom w:type="dxa" w:w="80"/>
+              <w:right w:type="dxa" w:w="110"/>
+            </w:tcMar>
+          </w:tcPr>
+          <w:p>
+            <w:pPr>
+              <w:spacing w:after="40"/>
+            </w:pPr>
+            <w:r>
+              <w:rPr>
+                <w:b w:val="false"/>
+                <w:bCs w:val="false"/>
+                <w:sz w:val="19"/>
+                <w:szCs w:val="19"/>
+              </w:rPr>
+              <w:t xml:space="preserve">≈£2,700</w:t>
+            </w:r>
+          </w:p>
+        </w:tc>
+      </w:tr>
+      <w:tr>
+        <w:trPr>
+          <w:tblHeader w:val="false"/>
+        </w:trPr>
+        <w:tc>
+          <w:tcPr>
+            <w:tcW w:type="dxa" w:w="3000"/>
+            <w:tcBorders>
+              <w:top w:val="single" w:color="E6E3DA" w:sz="4"/>
+              <w:left w:val="single" w:color="E6E3DA" w:sz="4"/>
+              <w:bottom w:val="single" w:color="E6E3DA" w:sz="4"/>
+              <w:right w:val="single" w:color="E6E3DA" w:sz="4"/>
+            </w:tcBorders>
+            <w:shd w:fill="FAF7F1" w:color="auto" w:val="clear"/>
+            <w:tcMar>
+              <w:top w:type="dxa" w:w="80"/>
+              <w:left w:type="dxa" w:w="110"/>
+              <w:bottom w:type="dxa" w:w="80"/>
+              <w:right w:type="dxa" w:w="110"/>
+            </w:tcMar>
+          </w:tcPr>
+          <w:p>
+            <w:pPr>
+              <w:spacing w:after="40"/>
+            </w:pPr>
+            <w:r>
+              <w:rPr>
+                <w:b/>
+                <w:bCs/>
+                <w:sz w:val="19"/>
+                <w:szCs w:val="19"/>
+              </w:rPr>
+              <w:t xml:space="preserve">Brevo</w:t>
+            </w:r>
+          </w:p>
+        </w:tc>
+        <w:tc>
+          <w:tcPr>
+            <w:tcW w:type="dxa" w:w="2000"/>
+            <w:tcBorders>
+              <w:top w:val="single" w:color="E6E3DA" w:sz="4"/>
+              <w:left w:val="single" w:color="E6E3DA" w:sz="4"/>
+              <w:bottom w:val="single" w:color="E6E3DA" w:sz="4"/>
+              <w:right w:val="single" w:color="E6E3DA" w:sz="4"/>
+            </w:tcBorders>
+            <w:tcMar>
+              <w:top w:type="dxa" w:w="80"/>
+              <w:left w:type="dxa" w:w="110"/>
+              <w:bottom w:type="dxa" w:w="80"/>
+              <w:right w:type="dxa" w:w="110"/>
+            </w:tcMar>
+          </w:tcPr>
+          <w:p>
+            <w:pPr>
+              <w:spacing w:after="40"/>
+            </w:pPr>
+            <w:r>
+              <w:rPr>
+                <w:b w:val="false"/>
+                <w:bCs w:val="false"/>
+                <w:sz w:val="19"/>
+                <w:szCs w:val="19"/>
+              </w:rPr>
+              <w:t xml:space="preserve">≈£75–100</w:t>
+            </w:r>
+          </w:p>
+        </w:tc>
+        <w:tc>
+          <w:tcPr>
+            <w:tcW w:type="dxa" w:w="2000"/>
+            <w:tcBorders>
+              <w:top w:val="single" w:color="E6E3DA" w:sz="4"/>
+              <w:left w:val="single" w:color="E6E3DA" w:sz="4"/>
+              <w:bottom w:val="single" w:color="E6E3DA" w:sz="4"/>
+              <w:right w:val="single" w:color="E6E3DA" w:sz="4"/>
+            </w:tcBorders>
+            <w:tcMar>
+              <w:top w:type="dxa" w:w="80"/>
+              <w:left w:type="dxa" w:w="110"/>
+              <w:bottom w:type="dxa" w:w="80"/>
+              <w:right w:type="dxa" w:w="110"/>
+            </w:tcMar>
+          </w:tcPr>
+          <w:p>
+            <w:pPr>
+              <w:spacing w:after="40"/>
+            </w:pPr>
+            <w:r>
+              <w:rPr>
+                <w:b w:val="false"/>
+                <w:bCs w:val="false"/>
+                <w:sz w:val="19"/>
+                <w:szCs w:val="19"/>
+              </w:rPr>
+              <w:t xml:space="preserve">≈£150–175</w:t>
+            </w:r>
+          </w:p>
+        </w:tc>
+        <w:tc>
+          <w:tcPr>
+            <w:tcW w:type="dxa" w:w="2026"/>
+            <w:tcBorders>
+              <w:top w:val="single" w:color="E6E3DA" w:sz="4"/>
+              <w:left w:val="single" w:color="E6E3DA" w:sz="4"/>
+              <w:bottom w:val="single" w:color="E6E3DA" w:sz="4"/>
+              <w:right w:val="single" w:color="E6E3DA" w:sz="4"/>
+            </w:tcBorders>
+            <w:tcMar>
+              <w:top w:type="dxa" w:w="80"/>
+              <w:left w:type="dxa" w:w="110"/>
+              <w:bottom w:type="dxa" w:w="80"/>
+              <w:right w:type="dxa" w:w="110"/>
+            </w:tcMar>
+          </w:tcPr>
+          <w:p>
+            <w:pPr>
+              <w:spacing w:after="40"/>
+            </w:pPr>
+            <w:r>
+              <w:rPr>
+                <w:b w:val="false"/>
+                <w:bCs w:val="false"/>
+                <w:sz w:val="19"/>
+                <w:szCs w:val="19"/>
+              </w:rPr>
+              <w:t xml:space="preserve">≈£1,800–2,100</w:t>
+            </w:r>
+          </w:p>
+        </w:tc>
+      </w:tr>
+    </w:tbl>
+    <w:p>
+      <w:pPr>
+        <w:spacing w:after="120"/>
+      </w:pPr>
+      <w:r>
+        <w:rPr>
+          <w:i/>
+          <w:iCs/>
+          <w:color w:val="555555"/>
+          <w:sz w:val="18"/>
+          <w:szCs w:val="18"/>
+        </w:rPr>
+        <w:t xml:space="preserve">Converted from USD at about £0.74 per $1, before VAT; SMS excluded. Omnisend not priced (quote needed).</w:t>
+      </w:r>
+    </w:p>
+    <w:p>
+      <w:pPr>
+        <w:spacing w:after="120"/>
+      </w:pPr>
+      <w:r>
+        <w:rPr>
+          <w:b/>
+          <w:bCs/>
+        </w:rPr>
+        <w:t xml:space="preserve">Put another way: </w:t>
+      </w:r>
+      <w:r>
+        <w:t xml:space="preserve">moving to Spoks saves about £2,700 a year, but costs more hands-on time now and loses some build-pack features. The saving is real but modest next to email revenue (flows made about £110k in the last 12 months), so a platform that performs even slightly worse would cost more than it saves.</w:t>
+      </w:r>
+    </w:p>
+    <w:p>
+      <w:pPr>
+        <w:pStyle w:val="Heading1"/>
+        <w:spacing w:after="140" w:before="320"/>
+      </w:pPr>
+      <w:r>
+        <w:t xml:space="preserve">8. What drives the choice</w:t>
       </w:r>
     </w:p>
     <w:tbl>
@@ -3282,20 +3867,7 @@
         <w:spacing w:after="140" w:before="320"/>
       </w:pPr>
       <w:r>
-        <w:t xml:space="preserve">8. Next steps</w:t>
-      </w:r>
-    </w:p>
-    <w:p>
-      <w:pPr>
-        <w:pStyle w:val="ListParagraph"/>
-        <w:numPr>
-          <w:ilvl w:val="0"/>
-          <w:numId w:val="2"/>
-        </w:numPr>
-        <w:spacing w:after="60"/>
-      </w:pPr>
-      <w:r>
-        <w:t xml:space="preserve">Confirm our current Klaviyo monthly cost so the saving is a real number.</w:t>
+        <w:t xml:space="preserve">9. Next steps</w:t>
       </w:r>
     </w:p>
     <w:p>

</xml_diff>